<commit_message>
Brand-template provision: branded demo template + --template-docx flag
Organizations supply their own brand template (.docx/.dotx with logo);
apply_styles only empties the template BODY, so header/footer branding
survives into every output. make_template.py now demonstrates this with
a generated logo PNG (pure-stdlib encoder) + wordmark in the header and
brand-colored heading styles. New --template-docx CLI flag lets users
point at an uploaded brand template without editing the profile YAML.

Co-Authored-By: Claude Fable 5 <noreply@anthropic.com>
Claude-Session: https://claude.ai/code/session_01MaCvGAJtQk5NQ2Jf2RxzaE
</commit_message>
<xml_diff>
--- a/templates/org_standard.docx
+++ b/templates/org_standard.docx
@@ -3,6 +3,7 @@
 <w:document xmlns:wpc="http://schemas.microsoft.com/office/word/2010/wordprocessingCanvas" xmlns:mo="http://schemas.microsoft.com/office/mac/office/2008/main" xmlns:mc="http://schemas.openxmlformats.org/markup-compatibility/2006" xmlns:mv="urn:schemas-microsoft-com:mac:vml" xmlns:o="urn:schemas-microsoft-com:office:office" xmlns:r="http://schemas.openxmlformats.org/officeDocument/2006/relationships" xmlns:m="http://schemas.openxmlformats.org/officeDocument/2006/math" xmlns:v="urn:schemas-microsoft-com:vml" xmlns:wp14="http://schemas.microsoft.com/office/word/2010/wordprocessingDrawing" xmlns:wp="http://schemas.openxmlformats.org/drawingml/2006/wordprocessingDrawing" xmlns:w10="urn:schemas-microsoft-com:office:word" xmlns:w="http://schemas.openxmlformats.org/wordprocessingml/2006/main" xmlns:w14="http://schemas.microsoft.com/office/word/2010/wordml" xmlns:wpg="http://schemas.microsoft.com/office/word/2010/wordprocessingGroup" xmlns:wpi="http://schemas.microsoft.com/office/word/2010/wordprocessingInk" xmlns:wne="http://schemas.microsoft.com/office/word/2006/wordml" xmlns:wps="http://schemas.microsoft.com/office/word/2010/wordprocessingShape" mc:Ignorable="w14 wp14">
   <w:body>
     <w:sectPr>
+      <w:headerReference w:type="default" r:id="rId9"/>
       <w:pgSz w:w="12240" w:h="15840"/>
       <w:pgMar w:top="1440" w:right="1800" w:bottom="1440" w:left="1800" w:header="720" w:footer="720" w:gutter="0"/>
       <w:cols w:space="720"/>
@@ -10,6 +11,57 @@
     </w:sectPr>
   </w:body>
 </w:document>
+</file>
+
+<file path=word/header1.xml><?xml version="1.0" encoding="utf-8"?>
+<w:hdr xmlns:m="http://schemas.openxmlformats.org/officeDocument/2006/math" xmlns:mc="http://schemas.openxmlformats.org/markup-compatibility/2006" xmlns:mo="http://schemas.microsoft.com/office/mac/office/2008/main" xmlns:mv="urn:schemas-microsoft-com:mac:vml" xmlns:o="urn:schemas-microsoft-com:office:office" xmlns:r="http://schemas.openxmlformats.org/officeDocument/2006/relationships" xmlns:v="urn:schemas-microsoft-com:vml" xmlns:w10="urn:schemas-microsoft-com:office:word" xmlns:w14="http://schemas.microsoft.com/office/word/2010/wordml" xmlns:w="http://schemas.openxmlformats.org/wordprocessingml/2006/main" xmlns:wne="http://schemas.microsoft.com/office/word/2006/wordml" xmlns:wp14="http://schemas.microsoft.com/office/word/2010/wordprocessingDrawing" xmlns:wp="http://schemas.openxmlformats.org/drawingml/2006/wordprocessingDrawing" xmlns:wpc="http://schemas.microsoft.com/office/word/2010/wordprocessingCanvas" xmlns:wpg="http://schemas.microsoft.com/office/word/2010/wordprocessingGroup" xmlns:wpi="http://schemas.microsoft.com/office/word/2010/wordprocessingInk" xmlns:wps="http://schemas.microsoft.com/office/word/2010/wordprocessingShape" mc:Ignorable="w14 wp14">
+  <w:p>
+    <w:pPr>
+      <w:pStyle w:val="Header"/>
+    </w:pPr>
+    <w:r>
+      <w:drawing>
+        <wp:inline xmlns:a="http://schemas.openxmlformats.org/drawingml/2006/main" xmlns:pic="http://schemas.openxmlformats.org/drawingml/2006/picture">
+          <wp:extent cx="304800" cy="304800"/>
+          <wp:docPr id="1" name="Picture 1"/>
+          <wp:cNvGraphicFramePr>
+            <a:graphicFrameLocks noChangeAspect="1"/>
+          </wp:cNvGraphicFramePr>
+          <a:graphic>
+            <a:graphicData uri="http://schemas.openxmlformats.org/drawingml/2006/picture">
+              <pic:pic>
+                <pic:nvPicPr>
+                  <pic:cNvPr id="0" name="acme_logo.png"/>
+                  <pic:cNvPicPr/>
+                </pic:nvPicPr>
+                <pic:blipFill>
+                  <a:blip r:embed="rId1"/>
+                  <a:stretch>
+                    <a:fillRect/>
+                  </a:stretch>
+                </pic:blipFill>
+                <pic:spPr>
+                  <a:xfrm>
+                    <a:off x="0" y="0"/>
+                    <a:ext cx="304800" cy="304800"/>
+                  </a:xfrm>
+                  <a:prstGeom prst="rect"/>
+                </pic:spPr>
+              </pic:pic>
+            </a:graphicData>
+          </a:graphic>
+        </wp:inline>
+      </w:drawing>
+    </w:r>
+    <w:r>
+      <w:rPr>
+        <w:b/>
+        <w:color w:val="1F4E79"/>
+      </w:rPr>
+      <w:t xml:space="preserve">  ACME CORP</w:t>
+    </w:r>
+  </w:p>
+</w:hdr>
 </file>
 
 <file path=word/numbering.xml><?xml version="1.0" encoding="utf-8"?>
@@ -438,7 +490,7 @@
       <w:rFonts w:asciiTheme="majorHAnsi" w:eastAsiaTheme="majorEastAsia" w:hAnsiTheme="majorHAnsi" w:cstheme="majorBidi"/>
       <w:b/>
       <w:bCs/>
-      <w:color w:val="365F91" w:themeColor="accent1" w:themeShade="BF"/>
+      <w:color w:val="1F4E79"/>
       <w:sz w:val="28"/>
       <w:szCs w:val="28"/>
     </w:rPr>
@@ -462,7 +514,7 @@
       <w:rFonts w:asciiTheme="majorHAnsi" w:eastAsiaTheme="majorEastAsia" w:hAnsiTheme="majorHAnsi" w:cstheme="majorBidi"/>
       <w:b/>
       <w:bCs/>
-      <w:color w:val="4F81BD" w:themeColor="accent1"/>
+      <w:color w:val="1F4E79"/>
       <w:sz w:val="26"/>
       <w:szCs w:val="26"/>
     </w:rPr>
@@ -486,7 +538,7 @@
       <w:rFonts w:asciiTheme="majorHAnsi" w:eastAsiaTheme="majorEastAsia" w:hAnsiTheme="majorHAnsi" w:cstheme="majorBidi"/>
       <w:b/>
       <w:bCs/>
-      <w:color w:val="4F81BD" w:themeColor="accent1"/>
+      <w:color w:val="1F4E79"/>
     </w:rPr>
   </w:style>
   <w:style w:type="paragraph" w:styleId="Heading4">

</xml_diff>